<commit_message>
Conexion front y back
</commit_message>
<xml_diff>
--- a/Notas/Notas.docx
+++ b/Notas/Notas.docx
@@ -63,7 +63,6 @@
           <w:bCs/>
         </w:rPr>
       </w:pPr>
-      <w:proofErr w:type="gramStart"/>
       <w:r>
         <w:rPr>
           <w:b/>
@@ -72,7 +71,6 @@
         </w:rPr>
         <w:t>Qué es Spring Boot?</w:t>
       </w:r>
-      <w:proofErr w:type="gramEnd"/>
     </w:p>
     <w:p>
       <w:r>
@@ -152,15 +150,7 @@
     </w:p>
     <w:p>
       <w:r>
-        <w:t xml:space="preserve">Java se baso en </w:t>
-      </w:r>
-      <w:proofErr w:type="gramStart"/>
-      <w:r>
-        <w:t>C</w:t>
-      </w:r>
-      <w:proofErr w:type="gramEnd"/>
-      <w:r>
-        <w:t xml:space="preserve"> pero sin basarse en los punteros de C</w:t>
+        <w:t>Java se baso en C pero sin basarse en los punteros de C</w:t>
       </w:r>
     </w:p>
     <w:p/>
@@ -231,32 +221,16 @@
     <w:p/>
     <w:p>
       <w:r>
-        <w:t xml:space="preserve">Spring </w:t>
-      </w:r>
-      <w:proofErr w:type="gramStart"/>
-      <w:r>
-        <w:t xml:space="preserve">boot  </w:t>
-      </w:r>
-      <w:r>
-        <w:t>Es</w:t>
-      </w:r>
-      <w:proofErr w:type="gramEnd"/>
-      <w:r>
-        <w:t xml:space="preserve"> una herramienta que permite realizar la integración de distintas bibliotecas de Spring</w:t>
-      </w:r>
-      <w:r>
-        <w:t xml:space="preserve"> </w:t>
-      </w:r>
-      <w:proofErr w:type="gramStart"/>
-      <w:r>
-        <w:t xml:space="preserve">Framework </w:t>
-      </w:r>
-      <w:r>
-        <w:t xml:space="preserve"> todo</w:t>
-      </w:r>
-      <w:proofErr w:type="gramEnd"/>
-      <w:r>
-        <w:t xml:space="preserve"> eso lo simplificaron a un solo archivos</w:t>
+        <w:t xml:space="preserve">Spring boot  </w:t>
+      </w:r>
+      <w:r>
+        <w:t>Es una herramienta que permite realizar la integración de distintas bibliotecas de Spring</w:t>
+      </w:r>
+      <w:r>
+        <w:t xml:space="preserve"> Framework </w:t>
+      </w:r>
+      <w:r>
+        <w:t xml:space="preserve"> todo eso lo simplificaron a un solo archivos</w:t>
       </w:r>
     </w:p>
     <w:p/>
@@ -413,18 +387,10 @@
     <w:p>
       <w:r>
         <w:lastRenderedPageBreak/>
-        <w:t>Duda</w:t>
-      </w:r>
-      <w:proofErr w:type="gramStart"/>
-      <w:r>
-        <w:t xml:space="preserve">: </w:t>
-      </w:r>
-      <w:r>
-        <w:t>,</w:t>
-      </w:r>
-      <w:proofErr w:type="gramEnd"/>
-      <w:r>
-        <w:t xml:space="preserve"> Quería preguntar si con Spring Boot sería viable desarrollar una plataforma académica para ingeniería mecánica, tipo biblioteca de herramientas, donde se puedan integrar ecuaciones, interpolaciones, eficiencias y calculadoras para cursos como Termodinámica, Fluidos, Estática y Cálculo. ¿Qué tan factible sería y qué recomendaría para estructurarla bien?</w:t>
+        <w:t xml:space="preserve">Duda: </w:t>
+      </w:r>
+      <w:r>
+        <w:t>, Quería preguntar si con Spring Boot sería viable desarrollar una plataforma académica para ingeniería mecánica, tipo biblioteca de herramientas, donde se puedan integrar ecuaciones, interpolaciones, eficiencias y calculadoras para cursos como Termodinámica, Fluidos, Estática y Cálculo. ¿Qué tan factible sería y qué recomendaría para estructurarla bien?</w:t>
       </w:r>
     </w:p>
     <w:p>
@@ -449,15 +415,7 @@
         </w:r>
       </w:hyperlink>
       <w:r>
-        <w:t xml:space="preserve"> permite crear el </w:t>
-      </w:r>
-      <w:proofErr w:type="gramStart"/>
-      <w:r>
-        <w:t>esqueleto  de</w:t>
-      </w:r>
-      <w:proofErr w:type="gramEnd"/>
-      <w:r>
-        <w:t xml:space="preserve"> la APP</w:t>
+        <w:t xml:space="preserve"> permite crear el esqueleto  de la APP</w:t>
       </w:r>
     </w:p>
     <w:p>
@@ -681,15 +639,7 @@
     </w:p>
     <w:p>
       <w:r>
-        <w:t xml:space="preserve">Se usa dominio invertido porque es un sistema de agrupación. Agrupar los elementos, los dominios internamente son </w:t>
-      </w:r>
-      <w:proofErr w:type="gramStart"/>
-      <w:r>
-        <w:t>com.google</w:t>
-      </w:r>
-      <w:proofErr w:type="gramEnd"/>
-      <w:r>
-        <w:t xml:space="preserve"> es decir al reves</w:t>
+        <w:t>Se usa dominio invertido porque es un sistema de agrupación. Agrupar los elementos, los dominios internamente son com.google es decir al reves</w:t>
       </w:r>
     </w:p>
     <w:p>
@@ -1078,7 +1028,6 @@
             <w:hideMark/>
           </w:tcPr>
           <w:p>
-            <w:proofErr w:type="gramStart"/>
             <w:r>
               <w:rPr>
                 <w:b/>
@@ -1086,7 +1035,6 @@
               </w:rPr>
               <w:t>.properties</w:t>
             </w:r>
-            <w:proofErr w:type="gramEnd"/>
           </w:p>
         </w:tc>
         <w:tc>
@@ -1125,21 +1073,12 @@
             <w:hideMark/>
           </w:tcPr>
           <w:p>
-            <w:proofErr w:type="gramStart"/>
             <w:r>
               <w:rPr>
                 <w:b/>
                 <w:bCs/>
               </w:rPr>
-              <w:t>.yml</w:t>
-            </w:r>
-            <w:proofErr w:type="gramEnd"/>
-            <w:r>
-              <w:rPr>
-                <w:b/>
-                <w:bCs/>
-              </w:rPr>
-              <w:t xml:space="preserve"> (YAML)</w:t>
+              <w:t>.yml (YAML)</w:t>
             </w:r>
           </w:p>
         </w:tc>
@@ -1238,13 +1177,8 @@
     </w:p>
     <w:p>
       <w:r>
-        <w:t xml:space="preserve">Group </w:t>
-      </w:r>
-      <w:proofErr w:type="gramStart"/>
-      <w:r>
-        <w:t>com.dev.arturojm</w:t>
-      </w:r>
-      <w:proofErr w:type="gramEnd"/>
+        <w:t>Group com.dev.arturojm</w:t>
+      </w:r>
     </w:p>
     <w:p>
       <w:r>
@@ -1301,27 +1235,14 @@
     <w:p/>
     <w:p>
       <w:r>
-        <w:t xml:space="preserve">Main ahí va el </w:t>
-      </w:r>
-      <w:proofErr w:type="gramStart"/>
-      <w:r>
-        <w:t>código java</w:t>
-      </w:r>
-      <w:proofErr w:type="gramEnd"/>
-      <w:r>
-        <w:t xml:space="preserve"> funcional, y test es para pruebas unitarias</w:t>
-      </w:r>
-    </w:p>
-    <w:p/>
-    <w:p>
-      <w:r>
-        <w:t xml:space="preserve">Aquí solo va </w:t>
-      </w:r>
-      <w:proofErr w:type="gramStart"/>
-      <w:r>
-        <w:t>código java</w:t>
-      </w:r>
-      <w:proofErr w:type="gramEnd"/>
+        <w:t>Main ahí va el código java funcional, y test es para pruebas unitarias</w:t>
+      </w:r>
+    </w:p>
+    <w:p/>
+    <w:p>
+      <w:r>
+        <w:t>Aquí solo va código java</w:t>
+      </w:r>
     </w:p>
     <w:p>
       <w:r>
@@ -1511,34 +1432,14 @@
           <w:color w:val="EE0000"/>
         </w:rPr>
       </w:pPr>
-      <w:proofErr w:type="gramStart"/>
       <w:r>
         <w:rPr>
           <w:b/>
           <w:bCs/>
           <w:color w:val="EE0000"/>
         </w:rPr>
-        <w:t>./</w:t>
-      </w:r>
-      <w:proofErr w:type="gramEnd"/>
-      <w:r>
-        <w:rPr>
-          <w:b/>
-          <w:bCs/>
-          <w:color w:val="EE0000"/>
-        </w:rPr>
-        <w:t>mvnw spring-</w:t>
-      </w:r>
-      <w:proofErr w:type="gramStart"/>
-      <w:r>
-        <w:rPr>
-          <w:b/>
-          <w:bCs/>
-          <w:color w:val="EE0000"/>
-        </w:rPr>
-        <w:t>boot:run</w:t>
-      </w:r>
-      <w:proofErr w:type="gramEnd"/>
+        <w:t>./mvnw spring-boot:run</w:t>
+      </w:r>
     </w:p>
     <w:p>
       <w:pPr>
@@ -2021,15 +1922,7 @@
         <w:t>Hey!</w:t>
       </w:r>
       <w:r>
-        <w:t xml:space="preserve"> repositorio búscame todas las reservas que estén en la base de datos" y si "</w:t>
-      </w:r>
-      <w:proofErr w:type="gramStart"/>
-      <w:r>
-        <w:t>esta vacío</w:t>
-      </w:r>
-      <w:proofErr w:type="gramEnd"/>
-      <w:r>
-        <w:t xml:space="preserve"> mandar una excepción de regla"</w:t>
+        <w:t xml:space="preserve"> repositorio búscame todas las reservas que estén en la base de datos" y si "esta vacío mandar una excepción de regla"</w:t>
       </w:r>
     </w:p>
     <w:p>
@@ -2085,6 +1978,1676 @@
         </w:drawing>
       </w:r>
     </w:p>
+    <w:p/>
+    <w:p/>
+    <w:p/>
+    <w:p/>
+    <w:p>
+      <w:pPr>
+        <w:rPr>
+          <w:b/>
+          <w:bCs/>
+          <w:color w:val="002060"/>
+          <w:sz w:val="48"/>
+          <w:szCs w:val="48"/>
+        </w:rPr>
+      </w:pPr>
+      <w:r>
+        <w:rPr>
+          <w:b/>
+          <w:bCs/>
+          <w:color w:val="002060"/>
+          <w:sz w:val="48"/>
+          <w:szCs w:val="48"/>
+          <w:highlight w:val="yellow"/>
+        </w:rPr>
+        <w:t>CLASE 2</w:t>
+      </w:r>
+    </w:p>
+    <w:p/>
+    <w:p>
+      <w:r>
+        <w:drawing>
+          <wp:inline distT="0" distB="0" distL="0" distR="0" wp14:anchorId="6C5F42DF" wp14:editId="34F1B81D">
+            <wp:extent cx="5612130" cy="2695575"/>
+            <wp:effectExtent l="0" t="0" r="7620" b="9525"/>
+            <wp:docPr id="1102487516" name="Imagen 1"/>
+            <wp:cNvGraphicFramePr>
+              <a:graphicFrameLocks xmlns:a="http://schemas.openxmlformats.org/drawingml/2006/main" noChangeAspect="1"/>
+            </wp:cNvGraphicFramePr>
+            <a:graphic xmlns:a="http://schemas.openxmlformats.org/drawingml/2006/main">
+              <a:graphicData uri="http://schemas.openxmlformats.org/drawingml/2006/picture">
+                <pic:pic xmlns:pic="http://schemas.openxmlformats.org/drawingml/2006/picture">
+                  <pic:nvPicPr>
+                    <pic:cNvPr id="1102487516" name=""/>
+                    <pic:cNvPicPr/>
+                  </pic:nvPicPr>
+                  <pic:blipFill>
+                    <a:blip r:embed="rId29"/>
+                    <a:stretch>
+                      <a:fillRect/>
+                    </a:stretch>
+                  </pic:blipFill>
+                  <pic:spPr>
+                    <a:xfrm>
+                      <a:off x="0" y="0"/>
+                      <a:ext cx="5612130" cy="2695575"/>
+                    </a:xfrm>
+                    <a:prstGeom prst="rect">
+                      <a:avLst/>
+                    </a:prstGeom>
+                  </pic:spPr>
+                </pic:pic>
+              </a:graphicData>
+            </a:graphic>
+          </wp:inline>
+        </w:drawing>
+      </w:r>
+      <w:r>
+        <w:drawing>
+          <wp:inline distT="0" distB="0" distL="0" distR="0" wp14:anchorId="46EA33B9" wp14:editId="53818FDD">
+            <wp:extent cx="5612130" cy="5278755"/>
+            <wp:effectExtent l="0" t="0" r="7620" b="0"/>
+            <wp:docPr id="1048205344" name="Imagen 1"/>
+            <wp:cNvGraphicFramePr>
+              <a:graphicFrameLocks xmlns:a="http://schemas.openxmlformats.org/drawingml/2006/main" noChangeAspect="1"/>
+            </wp:cNvGraphicFramePr>
+            <a:graphic xmlns:a="http://schemas.openxmlformats.org/drawingml/2006/main">
+              <a:graphicData uri="http://schemas.openxmlformats.org/drawingml/2006/picture">
+                <pic:pic xmlns:pic="http://schemas.openxmlformats.org/drawingml/2006/picture">
+                  <pic:nvPicPr>
+                    <pic:cNvPr id="1048205344" name=""/>
+                    <pic:cNvPicPr/>
+                  </pic:nvPicPr>
+                  <pic:blipFill>
+                    <a:blip r:embed="rId30"/>
+                    <a:stretch>
+                      <a:fillRect/>
+                    </a:stretch>
+                  </pic:blipFill>
+                  <pic:spPr>
+                    <a:xfrm>
+                      <a:off x="0" y="0"/>
+                      <a:ext cx="5612130" cy="5278755"/>
+                    </a:xfrm>
+                    <a:prstGeom prst="rect">
+                      <a:avLst/>
+                    </a:prstGeom>
+                  </pic:spPr>
+                </pic:pic>
+              </a:graphicData>
+            </a:graphic>
+          </wp:inline>
+        </w:drawing>
+      </w:r>
+    </w:p>
+    <w:p>
+      <w:r>
+        <w:t>Hay  tvarios de tipos de servicios</w:t>
+      </w:r>
+    </w:p>
+    <w:p>
+      <w:r>
+        <w:lastRenderedPageBreak/>
+        <w:drawing>
+          <wp:inline distT="0" distB="0" distL="0" distR="0" wp14:anchorId="59739D4F" wp14:editId="3283FD98">
+            <wp:extent cx="5612130" cy="4771390"/>
+            <wp:effectExtent l="0" t="0" r="7620" b="0"/>
+            <wp:docPr id="1963867601" name="Imagen 1"/>
+            <wp:cNvGraphicFramePr>
+              <a:graphicFrameLocks xmlns:a="http://schemas.openxmlformats.org/drawingml/2006/main" noChangeAspect="1"/>
+            </wp:cNvGraphicFramePr>
+            <a:graphic xmlns:a="http://schemas.openxmlformats.org/drawingml/2006/main">
+              <a:graphicData uri="http://schemas.openxmlformats.org/drawingml/2006/picture">
+                <pic:pic xmlns:pic="http://schemas.openxmlformats.org/drawingml/2006/picture">
+                  <pic:nvPicPr>
+                    <pic:cNvPr id="1963867601" name=""/>
+                    <pic:cNvPicPr/>
+                  </pic:nvPicPr>
+                  <pic:blipFill>
+                    <a:blip r:embed="rId31"/>
+                    <a:stretch>
+                      <a:fillRect/>
+                    </a:stretch>
+                  </pic:blipFill>
+                  <pic:spPr>
+                    <a:xfrm>
+                      <a:off x="0" y="0"/>
+                      <a:ext cx="5612130" cy="4771390"/>
+                    </a:xfrm>
+                    <a:prstGeom prst="rect">
+                      <a:avLst/>
+                    </a:prstGeom>
+                  </pic:spPr>
+                </pic:pic>
+              </a:graphicData>
+            </a:graphic>
+          </wp:inline>
+        </w:drawing>
+      </w:r>
+    </w:p>
+    <w:p/>
+    <w:p>
+      <w:pPr>
+        <w:rPr>
+          <w:b/>
+          <w:bCs/>
+          <w:color w:val="EE0000"/>
+        </w:rPr>
+      </w:pPr>
+      <w:r>
+        <w:rPr>
+          <w:b/>
+          <w:bCs/>
+          <w:color w:val="EE0000"/>
+        </w:rPr>
+        <w:t>Evitar citas al mismo tiempo y decir ya esta asignada una cita a esa hora</w:t>
+      </w:r>
+    </w:p>
+    <w:p/>
+    <w:p>
+      <w:r>
+        <w:t>React es una biblioteca sobre todo Frontend</w:t>
+      </w:r>
+      <w:r>
+        <w:br/>
+        <w:t>las funciones son en JS o TypeScript</w:t>
+      </w:r>
+    </w:p>
+    <w:p/>
+    <w:p>
+      <w:r>
+        <w:t>React resuelve lo de los componentes</w:t>
+      </w:r>
+    </w:p>
+    <w:p/>
+    <w:p>
+      <w:r>
+        <w:t>Angular es mas que los componentes, angular ya viene preconfigurado</w:t>
+      </w:r>
+    </w:p>
+    <w:p/>
+    <w:p/>
+    <w:p>
+      <w:pPr>
+        <w:rPr>
+          <w:b/>
+          <w:bCs/>
+        </w:rPr>
+      </w:pPr>
+      <w:r>
+        <w:rPr>
+          <w:b/>
+          <w:bCs/>
+        </w:rPr>
+        <w:t>ANGULAR ESTÁ MÁS ORIENTADO A MVC QUE ES ÚTIL PARA NUESTRA PROGRAMACIÓN ORIENTADA A OBJETOS</w:t>
+      </w:r>
+    </w:p>
+    <w:p/>
+    <w:p>
+      <w:r>
+        <w:t>Angular es programación orientada a objetos</w:t>
+      </w:r>
+    </w:p>
+    <w:p/>
+    <w:p/>
+    <w:p>
+      <w:r>
+        <w:t>Para que genere la carpeta target</w:t>
+      </w:r>
+    </w:p>
+    <w:p/>
+    <w:p>
+      <w:r>
+        <w:drawing>
+          <wp:inline distT="0" distB="0" distL="0" distR="0" wp14:anchorId="47AD83AA" wp14:editId="66A0E247">
+            <wp:extent cx="3057952" cy="1019317"/>
+            <wp:effectExtent l="0" t="0" r="9525" b="9525"/>
+            <wp:docPr id="930750229" name="Imagen 1"/>
+            <wp:cNvGraphicFramePr>
+              <a:graphicFrameLocks xmlns:a="http://schemas.openxmlformats.org/drawingml/2006/main" noChangeAspect="1"/>
+            </wp:cNvGraphicFramePr>
+            <a:graphic xmlns:a="http://schemas.openxmlformats.org/drawingml/2006/main">
+              <a:graphicData uri="http://schemas.openxmlformats.org/drawingml/2006/picture">
+                <pic:pic xmlns:pic="http://schemas.openxmlformats.org/drawingml/2006/picture">
+                  <pic:nvPicPr>
+                    <pic:cNvPr id="930750229" name=""/>
+                    <pic:cNvPicPr/>
+                  </pic:nvPicPr>
+                  <pic:blipFill>
+                    <a:blip r:embed="rId32"/>
+                    <a:stretch>
+                      <a:fillRect/>
+                    </a:stretch>
+                  </pic:blipFill>
+                  <pic:spPr>
+                    <a:xfrm>
+                      <a:off x="0" y="0"/>
+                      <a:ext cx="3057952" cy="1019317"/>
+                    </a:xfrm>
+                    <a:prstGeom prst="rect">
+                      <a:avLst/>
+                    </a:prstGeom>
+                  </pic:spPr>
+                </pic:pic>
+              </a:graphicData>
+            </a:graphic>
+          </wp:inline>
+        </w:drawing>
+      </w:r>
+    </w:p>
+    <w:p/>
+    <w:p>
+      <w:r>
+        <w:t>Creamos la clase reservation</w:t>
+      </w:r>
+    </w:p>
+    <w:p>
+      <w:r>
+        <w:drawing>
+          <wp:inline distT="0" distB="0" distL="0" distR="0" wp14:anchorId="5A9CDD29" wp14:editId="4EDD481C">
+            <wp:extent cx="2619741" cy="990738"/>
+            <wp:effectExtent l="0" t="0" r="9525" b="0"/>
+            <wp:docPr id="26019835" name="Imagen 1"/>
+            <wp:cNvGraphicFramePr>
+              <a:graphicFrameLocks xmlns:a="http://schemas.openxmlformats.org/drawingml/2006/main" noChangeAspect="1"/>
+            </wp:cNvGraphicFramePr>
+            <a:graphic xmlns:a="http://schemas.openxmlformats.org/drawingml/2006/main">
+              <a:graphicData uri="http://schemas.openxmlformats.org/drawingml/2006/picture">
+                <pic:pic xmlns:pic="http://schemas.openxmlformats.org/drawingml/2006/picture">
+                  <pic:nvPicPr>
+                    <pic:cNvPr id="26019835" name=""/>
+                    <pic:cNvPicPr/>
+                  </pic:nvPicPr>
+                  <pic:blipFill>
+                    <a:blip r:embed="rId33"/>
+                    <a:stretch>
+                      <a:fillRect/>
+                    </a:stretch>
+                  </pic:blipFill>
+                  <pic:spPr>
+                    <a:xfrm>
+                      <a:off x="0" y="0"/>
+                      <a:ext cx="2619741" cy="990738"/>
+                    </a:xfrm>
+                    <a:prstGeom prst="rect">
+                      <a:avLst/>
+                    </a:prstGeom>
+                  </pic:spPr>
+                </pic:pic>
+              </a:graphicData>
+            </a:graphic>
+          </wp:inline>
+        </w:drawing>
+      </w:r>
+    </w:p>
+    <w:p/>
+    <w:p>
+      <w:r>
+        <w:t>Consultar si ya existe una reserva que coincida con la fecha y hora</w:t>
+      </w:r>
+    </w:p>
+    <w:p>
+      <w:r>
+        <w:drawing>
+          <wp:inline distT="0" distB="0" distL="0" distR="0" wp14:anchorId="368514F3" wp14:editId="1E3F6409">
+            <wp:extent cx="5612130" cy="784860"/>
+            <wp:effectExtent l="0" t="0" r="7620" b="0"/>
+            <wp:docPr id="2111113779" name="Imagen 1"/>
+            <wp:cNvGraphicFramePr>
+              <a:graphicFrameLocks xmlns:a="http://schemas.openxmlformats.org/drawingml/2006/main" noChangeAspect="1"/>
+            </wp:cNvGraphicFramePr>
+            <a:graphic xmlns:a="http://schemas.openxmlformats.org/drawingml/2006/main">
+              <a:graphicData uri="http://schemas.openxmlformats.org/drawingml/2006/picture">
+                <pic:pic xmlns:pic="http://schemas.openxmlformats.org/drawingml/2006/picture">
+                  <pic:nvPicPr>
+                    <pic:cNvPr id="2111113779" name=""/>
+                    <pic:cNvPicPr/>
+                  </pic:nvPicPr>
+                  <pic:blipFill>
+                    <a:blip r:embed="rId34"/>
+                    <a:stretch>
+                      <a:fillRect/>
+                    </a:stretch>
+                  </pic:blipFill>
+                  <pic:spPr>
+                    <a:xfrm>
+                      <a:off x="0" y="0"/>
+                      <a:ext cx="5612130" cy="784860"/>
+                    </a:xfrm>
+                    <a:prstGeom prst="rect">
+                      <a:avLst/>
+                    </a:prstGeom>
+                  </pic:spPr>
+                </pic:pic>
+              </a:graphicData>
+            </a:graphic>
+          </wp:inline>
+        </w:drawing>
+      </w:r>
+    </w:p>
+    <w:p/>
+    <w:p>
+      <w:r>
+        <w:t>Guardar la reserva mientras no este ocupado esa hora esas son las REGLAS DE NEGOCIO</w:t>
+      </w:r>
+    </w:p>
+    <w:p/>
+    <w:p>
+      <w:pPr>
+        <w:rPr>
+          <w:b/>
+          <w:bCs/>
+        </w:rPr>
+      </w:pPr>
+      <w:r>
+        <w:rPr>
+          <w:b/>
+          <w:bCs/>
+        </w:rPr>
+        <w:t>Restricciones</w:t>
+      </w:r>
+    </w:p>
+    <w:p>
+      <w:r>
+        <w:t>que todos los campos sean obligatorios</w:t>
+      </w:r>
+    </w:p>
+    <w:p>
+      <w:r>
+        <w:drawing>
+          <wp:inline distT="0" distB="0" distL="0" distR="0" wp14:anchorId="7276D4B8" wp14:editId="58B491EE">
+            <wp:extent cx="5612130" cy="2210435"/>
+            <wp:effectExtent l="0" t="0" r="7620" b="0"/>
+            <wp:docPr id="2065033548" name="Imagen 1"/>
+            <wp:cNvGraphicFramePr>
+              <a:graphicFrameLocks xmlns:a="http://schemas.openxmlformats.org/drawingml/2006/main" noChangeAspect="1"/>
+            </wp:cNvGraphicFramePr>
+            <a:graphic xmlns:a="http://schemas.openxmlformats.org/drawingml/2006/main">
+              <a:graphicData uri="http://schemas.openxmlformats.org/drawingml/2006/picture">
+                <pic:pic xmlns:pic="http://schemas.openxmlformats.org/drawingml/2006/picture">
+                  <pic:nvPicPr>
+                    <pic:cNvPr id="2065033548" name=""/>
+                    <pic:cNvPicPr/>
+                  </pic:nvPicPr>
+                  <pic:blipFill>
+                    <a:blip r:embed="rId35"/>
+                    <a:stretch>
+                      <a:fillRect/>
+                    </a:stretch>
+                  </pic:blipFill>
+                  <pic:spPr>
+                    <a:xfrm>
+                      <a:off x="0" y="0"/>
+                      <a:ext cx="5612130" cy="2210435"/>
+                    </a:xfrm>
+                    <a:prstGeom prst="rect">
+                      <a:avLst/>
+                    </a:prstGeom>
+                  </pic:spPr>
+                </pic:pic>
+              </a:graphicData>
+            </a:graphic>
+          </wp:inline>
+        </w:drawing>
+      </w:r>
+    </w:p>
+    <w:p/>
+    <w:p>
+      <w:r>
+        <w:t>Si todo esta bien, guardar reserva</w:t>
+      </w:r>
+    </w:p>
+    <w:p/>
+    <w:p>
+      <w:pPr>
+        <w:rPr>
+          <w:b/>
+          <w:bCs/>
+        </w:rPr>
+      </w:pPr>
+      <w:r>
+        <w:rPr>
+          <w:b/>
+          <w:bCs/>
+        </w:rPr>
+        <w:t>Tener los siguientes metodos</w:t>
+      </w:r>
+    </w:p>
+    <w:p>
+      <w:r>
+        <w:t xml:space="preserve">Crear </w:t>
+      </w:r>
+    </w:p>
+    <w:p>
+      <w:r>
+        <w:t>Cancelar</w:t>
+      </w:r>
+    </w:p>
+    <w:p>
+      <w:r>
+        <w:lastRenderedPageBreak/>
+        <w:t>Listar</w:t>
+      </w:r>
+    </w:p>
+    <w:p>
+      <w:r>
+        <w:drawing>
+          <wp:inline distT="0" distB="0" distL="0" distR="0" wp14:anchorId="44B128AF" wp14:editId="77F9AC9E">
+            <wp:extent cx="5612130" cy="2338705"/>
+            <wp:effectExtent l="0" t="0" r="7620" b="4445"/>
+            <wp:docPr id="1685780296" name="Imagen 1"/>
+            <wp:cNvGraphicFramePr>
+              <a:graphicFrameLocks xmlns:a="http://schemas.openxmlformats.org/drawingml/2006/main" noChangeAspect="1"/>
+            </wp:cNvGraphicFramePr>
+            <a:graphic xmlns:a="http://schemas.openxmlformats.org/drawingml/2006/main">
+              <a:graphicData uri="http://schemas.openxmlformats.org/drawingml/2006/picture">
+                <pic:pic xmlns:pic="http://schemas.openxmlformats.org/drawingml/2006/picture">
+                  <pic:nvPicPr>
+                    <pic:cNvPr id="1685780296" name=""/>
+                    <pic:cNvPicPr/>
+                  </pic:nvPicPr>
+                  <pic:blipFill>
+                    <a:blip r:embed="rId36"/>
+                    <a:stretch>
+                      <a:fillRect/>
+                    </a:stretch>
+                  </pic:blipFill>
+                  <pic:spPr>
+                    <a:xfrm>
+                      <a:off x="0" y="0"/>
+                      <a:ext cx="5612130" cy="2338705"/>
+                    </a:xfrm>
+                    <a:prstGeom prst="rect">
+                      <a:avLst/>
+                    </a:prstGeom>
+                  </pic:spPr>
+                </pic:pic>
+              </a:graphicData>
+            </a:graphic>
+          </wp:inline>
+        </w:drawing>
+      </w:r>
+    </w:p>
+    <w:p/>
+    <w:p>
+      <w:r>
+        <w:t>Crea un controlador REST para la entidad Reserva. Debe exponer los siguientes endpoints: GET /reservas listar todas las reservas POST /reservas crear una nueva reserva DELETE /reservas/{id} cancelar una reserva Devuelve códigos de estado HTTP adecuados en cada caso.</w:t>
+      </w:r>
+      <w:r>
+        <w:t xml:space="preserve"> </w:t>
+      </w:r>
+    </w:p>
+    <w:p/>
+    <w:p>
+      <w:r>
+        <w:t>Todo en java son clases</w:t>
+      </w:r>
+    </w:p>
+    <w:p/>
+    <w:p/>
+    <w:p>
+      <w:r>
+        <w:t>Esa carpeta es para manejo de errores, es un controlador de excepciones</w:t>
+      </w:r>
+    </w:p>
+    <w:p>
+      <w:r>
+        <w:drawing>
+          <wp:inline distT="0" distB="0" distL="0" distR="0" wp14:anchorId="0B2EA399" wp14:editId="1746DD28">
+            <wp:extent cx="2276793" cy="790685"/>
+            <wp:effectExtent l="0" t="0" r="9525" b="9525"/>
+            <wp:docPr id="243724365" name="Imagen 1"/>
+            <wp:cNvGraphicFramePr>
+              <a:graphicFrameLocks xmlns:a="http://schemas.openxmlformats.org/drawingml/2006/main" noChangeAspect="1"/>
+            </wp:cNvGraphicFramePr>
+            <a:graphic xmlns:a="http://schemas.openxmlformats.org/drawingml/2006/main">
+              <a:graphicData uri="http://schemas.openxmlformats.org/drawingml/2006/picture">
+                <pic:pic xmlns:pic="http://schemas.openxmlformats.org/drawingml/2006/picture">
+                  <pic:nvPicPr>
+                    <pic:cNvPr id="243724365" name=""/>
+                    <pic:cNvPicPr/>
+                  </pic:nvPicPr>
+                  <pic:blipFill>
+                    <a:blip r:embed="rId37"/>
+                    <a:stretch>
+                      <a:fillRect/>
+                    </a:stretch>
+                  </pic:blipFill>
+                  <pic:spPr>
+                    <a:xfrm>
+                      <a:off x="0" y="0"/>
+                      <a:ext cx="2276793" cy="790685"/>
+                    </a:xfrm>
+                    <a:prstGeom prst="rect">
+                      <a:avLst/>
+                    </a:prstGeom>
+                  </pic:spPr>
+                </pic:pic>
+              </a:graphicData>
+            </a:graphic>
+          </wp:inline>
+        </w:drawing>
+      </w:r>
+    </w:p>
+    <w:p/>
+    <w:p/>
+    <w:p/>
+    <w:p>
+      <w:hyperlink r:id="rId38" w:history="1">
+        <w:r>
+          <w:rPr>
+            <w:rStyle w:val="Hipervnculo"/>
+          </w:rPr>
+          <w:t>http://localhost:8081/swagger-ui/index.html</w:t>
+        </w:r>
+      </w:hyperlink>
+    </w:p>
+    <w:p>
+      <w:r>
+        <w:drawing>
+          <wp:inline distT="0" distB="0" distL="0" distR="0" wp14:anchorId="53718070" wp14:editId="44592633">
+            <wp:extent cx="2715004" cy="2333951"/>
+            <wp:effectExtent l="0" t="0" r="9525" b="9525"/>
+            <wp:docPr id="1884593578" name="Imagen 1"/>
+            <wp:cNvGraphicFramePr>
+              <a:graphicFrameLocks xmlns:a="http://schemas.openxmlformats.org/drawingml/2006/main" noChangeAspect="1"/>
+            </wp:cNvGraphicFramePr>
+            <a:graphic xmlns:a="http://schemas.openxmlformats.org/drawingml/2006/main">
+              <a:graphicData uri="http://schemas.openxmlformats.org/drawingml/2006/picture">
+                <pic:pic xmlns:pic="http://schemas.openxmlformats.org/drawingml/2006/picture">
+                  <pic:nvPicPr>
+                    <pic:cNvPr id="1884593578" name=""/>
+                    <pic:cNvPicPr/>
+                  </pic:nvPicPr>
+                  <pic:blipFill>
+                    <a:blip r:embed="rId39"/>
+                    <a:stretch>
+                      <a:fillRect/>
+                    </a:stretch>
+                  </pic:blipFill>
+                  <pic:spPr>
+                    <a:xfrm>
+                      <a:off x="0" y="0"/>
+                      <a:ext cx="2715004" cy="2333951"/>
+                    </a:xfrm>
+                    <a:prstGeom prst="rect">
+                      <a:avLst/>
+                    </a:prstGeom>
+                  </pic:spPr>
+                </pic:pic>
+              </a:graphicData>
+            </a:graphic>
+          </wp:inline>
+        </w:drawing>
+      </w:r>
+    </w:p>
+    <w:p/>
+    <w:p>
+      <w:pPr>
+        <w:rPr>
+          <w:lang w:val="en-US"/>
+        </w:rPr>
+      </w:pPr>
+      <w:r>
+        <w:rPr>
+          <w:lang w:val="en-US"/>
+        </w:rPr>
+        <w:t>Al por</w:t>
+      </w:r>
+      <w:r>
+        <w:rPr>
+          <w:lang w:val="en-US"/>
+        </w:rPr>
+        <w:t>m</w:t>
+      </w:r>
+    </w:p>
+    <w:p>
+      <w:pPr>
+        <w:rPr>
+          <w:lang w:val="en-US"/>
+        </w:rPr>
+      </w:pPr>
+      <w:r>
+        <w:rPr>
+          <w:lang w:val="en-US"/>
+        </w:rPr>
+        <w:t>&lt;dependency&gt;</w:t>
+      </w:r>
+      <w:r>
+        <w:rPr>
+          <w:lang w:val="en-US"/>
+        </w:rPr>
+        <w:br/>
+        <w:t>            &lt;groupId&gt;org.springdoc&lt;/groupId&gt;</w:t>
+      </w:r>
+      <w:r>
+        <w:rPr>
+          <w:lang w:val="en-US"/>
+        </w:rPr>
+        <w:br/>
+        <w:t>            &lt;artifactId&gt;springdoc-openapi-starter-webmvc-ui&lt;/artifactId&gt;</w:t>
+      </w:r>
+      <w:r>
+        <w:rPr>
+          <w:lang w:val="en-US"/>
+        </w:rPr>
+        <w:br/>
+        <w:t>            &lt;version&gt;3.0.2&lt;/version&gt;</w:t>
+      </w:r>
+      <w:r>
+        <w:rPr>
+          <w:lang w:val="en-US"/>
+        </w:rPr>
+        <w:br/>
+        <w:t>        &lt;/dependency&gt;</w:t>
+      </w:r>
+    </w:p>
+    <w:p>
+      <w:pPr>
+        <w:rPr>
+          <w:lang w:val="en-US"/>
+        </w:rPr>
+      </w:pPr>
+    </w:p>
+    <w:p>
+      <w:pPr>
+        <w:rPr>
+          <w:lang w:val="en-US"/>
+        </w:rPr>
+      </w:pPr>
+      <w:r>
+        <w:rPr>
+          <w:lang w:val="en-US"/>
+        </w:rPr>
+        <w:drawing>
+          <wp:inline distT="0" distB="0" distL="0" distR="0" wp14:anchorId="6DEFA8AF" wp14:editId="7867D8C6">
+            <wp:extent cx="5612130" cy="2555240"/>
+            <wp:effectExtent l="0" t="0" r="7620" b="0"/>
+            <wp:docPr id="1362561459" name="Imagen 1"/>
+            <wp:cNvGraphicFramePr>
+              <a:graphicFrameLocks xmlns:a="http://schemas.openxmlformats.org/drawingml/2006/main" noChangeAspect="1"/>
+            </wp:cNvGraphicFramePr>
+            <a:graphic xmlns:a="http://schemas.openxmlformats.org/drawingml/2006/main">
+              <a:graphicData uri="http://schemas.openxmlformats.org/drawingml/2006/picture">
+                <pic:pic xmlns:pic="http://schemas.openxmlformats.org/drawingml/2006/picture">
+                  <pic:nvPicPr>
+                    <pic:cNvPr id="1362561459" name=""/>
+                    <pic:cNvPicPr/>
+                  </pic:nvPicPr>
+                  <pic:blipFill>
+                    <a:blip r:embed="rId40"/>
+                    <a:stretch>
+                      <a:fillRect/>
+                    </a:stretch>
+                  </pic:blipFill>
+                  <pic:spPr>
+                    <a:xfrm>
+                      <a:off x="0" y="0"/>
+                      <a:ext cx="5612130" cy="2555240"/>
+                    </a:xfrm>
+                    <a:prstGeom prst="rect">
+                      <a:avLst/>
+                    </a:prstGeom>
+                  </pic:spPr>
+                </pic:pic>
+              </a:graphicData>
+            </a:graphic>
+          </wp:inline>
+        </w:drawing>
+      </w:r>
+    </w:p>
+    <w:p>
+      <w:pPr>
+        <w:rPr>
+          <w:lang w:val="en-US"/>
+        </w:rPr>
+      </w:pPr>
+    </w:p>
+    <w:p>
+      <w:pPr>
+        <w:rPr>
+          <w:b/>
+          <w:bCs/>
+          <w:color w:val="3A7C22" w:themeColor="accent6" w:themeShade="BF"/>
+        </w:rPr>
+      </w:pPr>
+      <w:r>
+        <w:rPr>
+          <w:b/>
+          <w:bCs/>
+          <w:color w:val="3A7C22" w:themeColor="accent6" w:themeShade="BF"/>
+        </w:rPr>
+        <w:t xml:space="preserve">Backend es </w:t>
+      </w:r>
+      <w:r>
+        <w:rPr>
+          <w:b/>
+          <w:bCs/>
+          <w:color w:val="3A7C22" w:themeColor="accent6" w:themeShade="BF"/>
+        </w:rPr>
+        <w:t>lógica</w:t>
+      </w:r>
+      <w:r>
+        <w:rPr>
+          <w:b/>
+          <w:bCs/>
+          <w:color w:val="3A7C22" w:themeColor="accent6" w:themeShade="BF"/>
+        </w:rPr>
+        <w:t xml:space="preserve"> de negocio</w:t>
+      </w:r>
+    </w:p>
+    <w:p>
+      <w:pPr>
+        <w:rPr>
+          <w:b/>
+          <w:bCs/>
+          <w:color w:val="3A7C22" w:themeColor="accent6" w:themeShade="BF"/>
+        </w:rPr>
+      </w:pPr>
+      <w:r>
+        <w:rPr>
+          <w:b/>
+          <w:bCs/>
+          <w:color w:val="3A7C22" w:themeColor="accent6" w:themeShade="BF"/>
+        </w:rPr>
+        <w:t>Frontend es la visualización de interfaz y experiencia de usuario</w:t>
+      </w:r>
+    </w:p>
+    <w:p/>
+    <w:p>
+      <w:r>
+        <w:t>El propósito de Backend no es ser lindo sino ser funcional</w:t>
+      </w:r>
+    </w:p>
+    <w:p/>
+    <w:p>
+      <w:r>
+        <w:rPr>
+          <w:highlight w:val="yellow"/>
+        </w:rPr>
+        <w:t xml:space="preserve">En pocas palabras se va a tener 2 servicios de la misma </w:t>
+      </w:r>
+      <w:r>
+        <w:rPr>
+          <w:highlight w:val="yellow"/>
+        </w:rPr>
+        <w:t>aplicación</w:t>
+      </w:r>
+      <w:r>
+        <w:rPr>
+          <w:highlight w:val="yellow"/>
+        </w:rPr>
+        <w:t>, en el con angular para que la interfaz sea amigable y el backend con springboot</w:t>
+      </w:r>
+    </w:p>
+    <w:p/>
+    <w:p>
+      <w:pPr>
+        <w:rPr>
+          <w:b/>
+          <w:bCs/>
+        </w:rPr>
+      </w:pPr>
+      <w:r>
+        <w:rPr>
+          <w:b/>
+          <w:bCs/>
+        </w:rPr>
+        <w:t>Angular corre de lado del navegador</w:t>
+      </w:r>
+    </w:p>
+    <w:p>
+      <w:pPr>
+        <w:rPr>
+          <w:b/>
+          <w:bCs/>
+        </w:rPr>
+      </w:pPr>
+    </w:p>
+    <w:p>
+      <w:r>
+        <w:t>Angular usa TypeScript, es JS con más elementos; se le añadió manejo de tipo de datos y programación orientada a objetos</w:t>
+      </w:r>
+    </w:p>
+    <w:p/>
+    <w:p>
+      <w:r>
+        <w:t>Angular ocupa programación MVC</w:t>
+      </w:r>
+    </w:p>
+    <w:p/>
+    <w:p>
+      <w:r>
+        <w:t>Typescript es un archivo de logica</w:t>
+      </w:r>
+    </w:p>
+    <w:p/>
+    <w:p/>
+    <w:p/>
+    <w:p/>
+    <w:p>
+      <w:r>
+        <w:t>Instalar angular de forma globa es decir como una app de nuestra computadora</w:t>
+      </w:r>
+    </w:p>
+    <w:p>
+      <w:r>
+        <w:drawing>
+          <wp:inline distT="0" distB="0" distL="0" distR="0" wp14:anchorId="41ED7768" wp14:editId="4E0ABAA8">
+            <wp:extent cx="4277322" cy="1047896"/>
+            <wp:effectExtent l="0" t="0" r="9525" b="0"/>
+            <wp:docPr id="1265907976" name="Imagen 1"/>
+            <wp:cNvGraphicFramePr>
+              <a:graphicFrameLocks xmlns:a="http://schemas.openxmlformats.org/drawingml/2006/main" noChangeAspect="1"/>
+            </wp:cNvGraphicFramePr>
+            <a:graphic xmlns:a="http://schemas.openxmlformats.org/drawingml/2006/main">
+              <a:graphicData uri="http://schemas.openxmlformats.org/drawingml/2006/picture">
+                <pic:pic xmlns:pic="http://schemas.openxmlformats.org/drawingml/2006/picture">
+                  <pic:nvPicPr>
+                    <pic:cNvPr id="1265907976" name=""/>
+                    <pic:cNvPicPr/>
+                  </pic:nvPicPr>
+                  <pic:blipFill>
+                    <a:blip r:embed="rId41"/>
+                    <a:stretch>
+                      <a:fillRect/>
+                    </a:stretch>
+                  </pic:blipFill>
+                  <pic:spPr>
+                    <a:xfrm>
+                      <a:off x="0" y="0"/>
+                      <a:ext cx="4277322" cy="1047896"/>
+                    </a:xfrm>
+                    <a:prstGeom prst="rect">
+                      <a:avLst/>
+                    </a:prstGeom>
+                  </pic:spPr>
+                </pic:pic>
+              </a:graphicData>
+            </a:graphic>
+          </wp:inline>
+        </w:drawing>
+      </w:r>
+    </w:p>
+    <w:p/>
+    <w:p>
+      <w:r>
+        <w:t>Crear un proyecto en Angular</w:t>
+      </w:r>
+    </w:p>
+    <w:p>
+      <w:r>
+        <w:drawing>
+          <wp:inline distT="0" distB="0" distL="0" distR="0" wp14:anchorId="3755DEE2" wp14:editId="74545A1E">
+            <wp:extent cx="3334215" cy="1143160"/>
+            <wp:effectExtent l="0" t="0" r="0" b="0"/>
+            <wp:docPr id="1059446996" name="Imagen 1"/>
+            <wp:cNvGraphicFramePr>
+              <a:graphicFrameLocks xmlns:a="http://schemas.openxmlformats.org/drawingml/2006/main" noChangeAspect="1"/>
+            </wp:cNvGraphicFramePr>
+            <a:graphic xmlns:a="http://schemas.openxmlformats.org/drawingml/2006/main">
+              <a:graphicData uri="http://schemas.openxmlformats.org/drawingml/2006/picture">
+                <pic:pic xmlns:pic="http://schemas.openxmlformats.org/drawingml/2006/picture">
+                  <pic:nvPicPr>
+                    <pic:cNvPr id="1059446996" name=""/>
+                    <pic:cNvPicPr/>
+                  </pic:nvPicPr>
+                  <pic:blipFill>
+                    <a:blip r:embed="rId42"/>
+                    <a:stretch>
+                      <a:fillRect/>
+                    </a:stretch>
+                  </pic:blipFill>
+                  <pic:spPr>
+                    <a:xfrm>
+                      <a:off x="0" y="0"/>
+                      <a:ext cx="3334215" cy="1143160"/>
+                    </a:xfrm>
+                    <a:prstGeom prst="rect">
+                      <a:avLst/>
+                    </a:prstGeom>
+                  </pic:spPr>
+                </pic:pic>
+              </a:graphicData>
+            </a:graphic>
+          </wp:inline>
+        </w:drawing>
+      </w:r>
+    </w:p>
+    <w:p/>
+    <w:p>
+      <w:r>
+        <w:t>Abrir rápidamente cmd, solo remplza por la url de la carpeta</w:t>
+      </w:r>
+    </w:p>
+    <w:p>
+      <w:r>
+        <w:drawing>
+          <wp:inline distT="0" distB="0" distL="0" distR="0" wp14:anchorId="4C1B63F9" wp14:editId="51D71A7A">
+            <wp:extent cx="3905795" cy="1857634"/>
+            <wp:effectExtent l="0" t="0" r="0" b="9525"/>
+            <wp:docPr id="1585444221" name="Imagen 1"/>
+            <wp:cNvGraphicFramePr>
+              <a:graphicFrameLocks xmlns:a="http://schemas.openxmlformats.org/drawingml/2006/main" noChangeAspect="1"/>
+            </wp:cNvGraphicFramePr>
+            <a:graphic xmlns:a="http://schemas.openxmlformats.org/drawingml/2006/main">
+              <a:graphicData uri="http://schemas.openxmlformats.org/drawingml/2006/picture">
+                <pic:pic xmlns:pic="http://schemas.openxmlformats.org/drawingml/2006/picture">
+                  <pic:nvPicPr>
+                    <pic:cNvPr id="1585444221" name=""/>
+                    <pic:cNvPicPr/>
+                  </pic:nvPicPr>
+                  <pic:blipFill>
+                    <a:blip r:embed="rId43"/>
+                    <a:stretch>
+                      <a:fillRect/>
+                    </a:stretch>
+                  </pic:blipFill>
+                  <pic:spPr>
+                    <a:xfrm>
+                      <a:off x="0" y="0"/>
+                      <a:ext cx="3905795" cy="1857634"/>
+                    </a:xfrm>
+                    <a:prstGeom prst="rect">
+                      <a:avLst/>
+                    </a:prstGeom>
+                  </pic:spPr>
+                </pic:pic>
+              </a:graphicData>
+            </a:graphic>
+          </wp:inline>
+        </w:drawing>
+      </w:r>
+    </w:p>
+    <w:p/>
+    <w:p>
+      <w:r>
+        <w:drawing>
+          <wp:inline distT="0" distB="0" distL="0" distR="0" wp14:anchorId="2B39A569" wp14:editId="5D8B7E97">
+            <wp:extent cx="4582164" cy="952633"/>
+            <wp:effectExtent l="0" t="0" r="0" b="0"/>
+            <wp:docPr id="177782006" name="Imagen 1"/>
+            <wp:cNvGraphicFramePr>
+              <a:graphicFrameLocks xmlns:a="http://schemas.openxmlformats.org/drawingml/2006/main" noChangeAspect="1"/>
+            </wp:cNvGraphicFramePr>
+            <a:graphic xmlns:a="http://schemas.openxmlformats.org/drawingml/2006/main">
+              <a:graphicData uri="http://schemas.openxmlformats.org/drawingml/2006/picture">
+                <pic:pic xmlns:pic="http://schemas.openxmlformats.org/drawingml/2006/picture">
+                  <pic:nvPicPr>
+                    <pic:cNvPr id="177782006" name=""/>
+                    <pic:cNvPicPr/>
+                  </pic:nvPicPr>
+                  <pic:blipFill>
+                    <a:blip r:embed="rId44"/>
+                    <a:stretch>
+                      <a:fillRect/>
+                    </a:stretch>
+                  </pic:blipFill>
+                  <pic:spPr>
+                    <a:xfrm>
+                      <a:off x="0" y="0"/>
+                      <a:ext cx="4582164" cy="952633"/>
+                    </a:xfrm>
+                    <a:prstGeom prst="rect">
+                      <a:avLst/>
+                    </a:prstGeom>
+                  </pic:spPr>
+                </pic:pic>
+              </a:graphicData>
+            </a:graphic>
+          </wp:inline>
+        </w:drawing>
+      </w:r>
+    </w:p>
+    <w:p/>
+    <w:p>
+      <w:r>
+        <w:t>Escoger el front</w:t>
+      </w:r>
+    </w:p>
+    <w:p>
+      <w:r>
+        <w:drawing>
+          <wp:inline distT="0" distB="0" distL="0" distR="0" wp14:anchorId="19079DCF" wp14:editId="25F0441A">
+            <wp:extent cx="5612130" cy="932815"/>
+            <wp:effectExtent l="0" t="0" r="7620" b="635"/>
+            <wp:docPr id="1754985345" name="Imagen 1"/>
+            <wp:cNvGraphicFramePr>
+              <a:graphicFrameLocks xmlns:a="http://schemas.openxmlformats.org/drawingml/2006/main" noChangeAspect="1"/>
+            </wp:cNvGraphicFramePr>
+            <a:graphic xmlns:a="http://schemas.openxmlformats.org/drawingml/2006/main">
+              <a:graphicData uri="http://schemas.openxmlformats.org/drawingml/2006/picture">
+                <pic:pic xmlns:pic="http://schemas.openxmlformats.org/drawingml/2006/picture">
+                  <pic:nvPicPr>
+                    <pic:cNvPr id="1754985345" name=""/>
+                    <pic:cNvPicPr/>
+                  </pic:nvPicPr>
+                  <pic:blipFill>
+                    <a:blip r:embed="rId45"/>
+                    <a:stretch>
+                      <a:fillRect/>
+                    </a:stretch>
+                  </pic:blipFill>
+                  <pic:spPr>
+                    <a:xfrm>
+                      <a:off x="0" y="0"/>
+                      <a:ext cx="5612130" cy="932815"/>
+                    </a:xfrm>
+                    <a:prstGeom prst="rect">
+                      <a:avLst/>
+                    </a:prstGeom>
+                  </pic:spPr>
+                </pic:pic>
+              </a:graphicData>
+            </a:graphic>
+          </wp:inline>
+        </w:drawing>
+      </w:r>
+    </w:p>
+    <w:p/>
+    <w:p/>
+    <w:p/>
+    <w:p>
+      <w:r>
+        <w:lastRenderedPageBreak/>
+        <w:t>Escoger una IA</w:t>
+      </w:r>
+    </w:p>
+    <w:p>
+      <w:r>
+        <w:drawing>
+          <wp:inline distT="0" distB="0" distL="0" distR="0" wp14:anchorId="009AA8C9" wp14:editId="6F2336CC">
+            <wp:extent cx="5612130" cy="1203325"/>
+            <wp:effectExtent l="0" t="0" r="7620" b="0"/>
+            <wp:docPr id="1295337778" name="Imagen 1"/>
+            <wp:cNvGraphicFramePr>
+              <a:graphicFrameLocks xmlns:a="http://schemas.openxmlformats.org/drawingml/2006/main" noChangeAspect="1"/>
+            </wp:cNvGraphicFramePr>
+            <a:graphic xmlns:a="http://schemas.openxmlformats.org/drawingml/2006/main">
+              <a:graphicData uri="http://schemas.openxmlformats.org/drawingml/2006/picture">
+                <pic:pic xmlns:pic="http://schemas.openxmlformats.org/drawingml/2006/picture">
+                  <pic:nvPicPr>
+                    <pic:cNvPr id="1295337778" name=""/>
+                    <pic:cNvPicPr/>
+                  </pic:nvPicPr>
+                  <pic:blipFill>
+                    <a:blip r:embed="rId46"/>
+                    <a:stretch>
+                      <a:fillRect/>
+                    </a:stretch>
+                  </pic:blipFill>
+                  <pic:spPr>
+                    <a:xfrm>
+                      <a:off x="0" y="0"/>
+                      <a:ext cx="5612130" cy="1203325"/>
+                    </a:xfrm>
+                    <a:prstGeom prst="rect">
+                      <a:avLst/>
+                    </a:prstGeom>
+                  </pic:spPr>
+                </pic:pic>
+              </a:graphicData>
+            </a:graphic>
+          </wp:inline>
+        </w:drawing>
+      </w:r>
+    </w:p>
+    <w:p/>
+    <w:p>
+      <w:r>
+        <w:br/>
+      </w:r>
+    </w:p>
+    <w:p>
+      <w:r>
+        <w:t>Tenemos tanto el backend como el frontend</w:t>
+      </w:r>
+    </w:p>
+    <w:p>
+      <w:r>
+        <w:drawing>
+          <wp:inline distT="0" distB="0" distL="0" distR="0" wp14:anchorId="3D85A600" wp14:editId="4B3E2990">
+            <wp:extent cx="3667637" cy="4620270"/>
+            <wp:effectExtent l="0" t="0" r="9525" b="8890"/>
+            <wp:docPr id="1625387007" name="Imagen 1"/>
+            <wp:cNvGraphicFramePr>
+              <a:graphicFrameLocks xmlns:a="http://schemas.openxmlformats.org/drawingml/2006/main" noChangeAspect="1"/>
+            </wp:cNvGraphicFramePr>
+            <a:graphic xmlns:a="http://schemas.openxmlformats.org/drawingml/2006/main">
+              <a:graphicData uri="http://schemas.openxmlformats.org/drawingml/2006/picture">
+                <pic:pic xmlns:pic="http://schemas.openxmlformats.org/drawingml/2006/picture">
+                  <pic:nvPicPr>
+                    <pic:cNvPr id="1625387007" name=""/>
+                    <pic:cNvPicPr/>
+                  </pic:nvPicPr>
+                  <pic:blipFill>
+                    <a:blip r:embed="rId47"/>
+                    <a:stretch>
+                      <a:fillRect/>
+                    </a:stretch>
+                  </pic:blipFill>
+                  <pic:spPr>
+                    <a:xfrm>
+                      <a:off x="0" y="0"/>
+                      <a:ext cx="3667637" cy="4620270"/>
+                    </a:xfrm>
+                    <a:prstGeom prst="rect">
+                      <a:avLst/>
+                    </a:prstGeom>
+                  </pic:spPr>
+                </pic:pic>
+              </a:graphicData>
+            </a:graphic>
+          </wp:inline>
+        </w:drawing>
+      </w:r>
+    </w:p>
+    <w:p/>
+    <w:p>
+      <w:pPr>
+        <w:rPr>
+          <w:b/>
+          <w:bCs/>
+          <w:color w:val="EE0000"/>
+          <w:lang w:val="en-US"/>
+        </w:rPr>
+      </w:pPr>
+      <w:r>
+        <w:rPr>
+          <w:b/>
+          <w:bCs/>
+          <w:color w:val="EE0000"/>
+          <w:lang w:val="en-US"/>
+        </w:rPr>
+        <w:t>./mvnw spring-boot:run</w:t>
+      </w:r>
+    </w:p>
+    <w:p>
+      <w:pPr>
+        <w:rPr>
+          <w:lang w:val="en-US"/>
+        </w:rPr>
+      </w:pPr>
+      <w:r>
+        <w:rPr>
+          <w:lang w:val="en-US"/>
+        </w:rPr>
+        <w:t>start</w:t>
+      </w:r>
+    </w:p>
+    <w:p>
+      <w:pPr>
+        <w:rPr>
+          <w:lang w:val="en-US"/>
+        </w:rPr>
+      </w:pPr>
+    </w:p>
+    <w:p>
+      <w:pPr>
+        <w:rPr>
+          <w:lang w:val="en-US"/>
+        </w:rPr>
+      </w:pPr>
+    </w:p>
+    <w:p>
+      <w:r>
+        <w:t>package json se guarda l</w:t>
+      </w:r>
+      <w:r>
+        <w:t>a configuración npm</w:t>
+      </w:r>
+    </w:p>
+    <w:p/>
+    <w:p>
+      <w:pPr>
+        <w:rPr>
+          <w:b/>
+          <w:bCs/>
+          <w:color w:val="FFFFFF" w:themeColor="background1"/>
+          <w:sz w:val="32"/>
+          <w:szCs w:val="32"/>
+        </w:rPr>
+      </w:pPr>
+      <w:r>
+        <w:rPr>
+          <w:b/>
+          <w:bCs/>
+          <w:color w:val="FFFFFF" w:themeColor="background1"/>
+          <w:sz w:val="32"/>
+          <w:szCs w:val="32"/>
+          <w:highlight w:val="darkRed"/>
+        </w:rPr>
+        <w:t>Node modules nunca se sube a G</w:t>
+      </w:r>
+      <w:r>
+        <w:rPr>
+          <w:b/>
+          <w:bCs/>
+          <w:color w:val="FFFFFF" w:themeColor="background1"/>
+          <w:sz w:val="32"/>
+          <w:szCs w:val="32"/>
+          <w:highlight w:val="darkRed"/>
+        </w:rPr>
+        <w:t>it para eso es el package,json</w:t>
+      </w:r>
+    </w:p>
+    <w:p/>
+    <w:p>
+      <w:r>
+        <w:t xml:space="preserve">La carpeta </w:t>
+      </w:r>
+    </w:p>
+    <w:p/>
+    <w:p>
+      <w:r>
+        <w:t xml:space="preserve">Main inicializa el </w:t>
+      </w:r>
+      <w:r>
+        <w:t>proyecto</w:t>
+      </w:r>
+    </w:p>
+    <w:p/>
+    <w:p>
+      <w:r>
+        <w:t>App es el componente principal</w:t>
+      </w:r>
+    </w:p>
+    <w:p>
+      <w:r>
+        <w:drawing>
+          <wp:inline distT="0" distB="0" distL="0" distR="0" wp14:anchorId="53B18E90" wp14:editId="5DB7172F">
+            <wp:extent cx="1943371" cy="1810003"/>
+            <wp:effectExtent l="0" t="0" r="0" b="0"/>
+            <wp:docPr id="524354473" name="Imagen 1"/>
+            <wp:cNvGraphicFramePr>
+              <a:graphicFrameLocks xmlns:a="http://schemas.openxmlformats.org/drawingml/2006/main" noChangeAspect="1"/>
+            </wp:cNvGraphicFramePr>
+            <a:graphic xmlns:a="http://schemas.openxmlformats.org/drawingml/2006/main">
+              <a:graphicData uri="http://schemas.openxmlformats.org/drawingml/2006/picture">
+                <pic:pic xmlns:pic="http://schemas.openxmlformats.org/drawingml/2006/picture">
+                  <pic:nvPicPr>
+                    <pic:cNvPr id="524354473" name=""/>
+                    <pic:cNvPicPr/>
+                  </pic:nvPicPr>
+                  <pic:blipFill>
+                    <a:blip r:embed="rId48"/>
+                    <a:stretch>
+                      <a:fillRect/>
+                    </a:stretch>
+                  </pic:blipFill>
+                  <pic:spPr>
+                    <a:xfrm>
+                      <a:off x="0" y="0"/>
+                      <a:ext cx="1943371" cy="1810003"/>
+                    </a:xfrm>
+                    <a:prstGeom prst="rect">
+                      <a:avLst/>
+                    </a:prstGeom>
+                  </pic:spPr>
+                </pic:pic>
+              </a:graphicData>
+            </a:graphic>
+          </wp:inline>
+        </w:drawing>
+      </w:r>
+    </w:p>
+    <w:p/>
+    <w:p>
+      <w:r>
+        <w:t>Levantar el servidor de angular</w:t>
+      </w:r>
+    </w:p>
+    <w:p>
+      <w:r>
+        <w:drawing>
+          <wp:inline distT="0" distB="0" distL="0" distR="0" wp14:anchorId="1F0FC801" wp14:editId="3B788D14">
+            <wp:extent cx="1190791" cy="638264"/>
+            <wp:effectExtent l="0" t="0" r="9525" b="9525"/>
+            <wp:docPr id="1654653250" name="Imagen 1"/>
+            <wp:cNvGraphicFramePr>
+              <a:graphicFrameLocks xmlns:a="http://schemas.openxmlformats.org/drawingml/2006/main" noChangeAspect="1"/>
+            </wp:cNvGraphicFramePr>
+            <a:graphic xmlns:a="http://schemas.openxmlformats.org/drawingml/2006/main">
+              <a:graphicData uri="http://schemas.openxmlformats.org/drawingml/2006/picture">
+                <pic:pic xmlns:pic="http://schemas.openxmlformats.org/drawingml/2006/picture">
+                  <pic:nvPicPr>
+                    <pic:cNvPr id="1654653250" name=""/>
+                    <pic:cNvPicPr/>
+                  </pic:nvPicPr>
+                  <pic:blipFill>
+                    <a:blip r:embed="rId49"/>
+                    <a:stretch>
+                      <a:fillRect/>
+                    </a:stretch>
+                  </pic:blipFill>
+                  <pic:spPr>
+                    <a:xfrm>
+                      <a:off x="0" y="0"/>
+                      <a:ext cx="1190791" cy="638264"/>
+                    </a:xfrm>
+                    <a:prstGeom prst="rect">
+                      <a:avLst/>
+                    </a:prstGeom>
+                  </pic:spPr>
+                </pic:pic>
+              </a:graphicData>
+            </a:graphic>
+          </wp:inline>
+        </w:drawing>
+      </w:r>
+    </w:p>
+    <w:p/>
+    <w:p>
+      <w:r>
+        <w:t>Componente</w:t>
+      </w:r>
+    </w:p>
+    <w:p>
+      <w:r>
+        <w:drawing>
+          <wp:inline distT="0" distB="0" distL="0" distR="0" wp14:anchorId="0C5FE1C6" wp14:editId="5565234C">
+            <wp:extent cx="3991532" cy="2381582"/>
+            <wp:effectExtent l="0" t="0" r="9525" b="0"/>
+            <wp:docPr id="1530570635" name="Imagen 1"/>
+            <wp:cNvGraphicFramePr>
+              <a:graphicFrameLocks xmlns:a="http://schemas.openxmlformats.org/drawingml/2006/main" noChangeAspect="1"/>
+            </wp:cNvGraphicFramePr>
+            <a:graphic xmlns:a="http://schemas.openxmlformats.org/drawingml/2006/main">
+              <a:graphicData uri="http://schemas.openxmlformats.org/drawingml/2006/picture">
+                <pic:pic xmlns:pic="http://schemas.openxmlformats.org/drawingml/2006/picture">
+                  <pic:nvPicPr>
+                    <pic:cNvPr id="1530570635" name=""/>
+                    <pic:cNvPicPr/>
+                  </pic:nvPicPr>
+                  <pic:blipFill>
+                    <a:blip r:embed="rId50"/>
+                    <a:stretch>
+                      <a:fillRect/>
+                    </a:stretch>
+                  </pic:blipFill>
+                  <pic:spPr>
+                    <a:xfrm>
+                      <a:off x="0" y="0"/>
+                      <a:ext cx="3991532" cy="2381582"/>
+                    </a:xfrm>
+                    <a:prstGeom prst="rect">
+                      <a:avLst/>
+                    </a:prstGeom>
+                  </pic:spPr>
+                </pic:pic>
+              </a:graphicData>
+            </a:graphic>
+          </wp:inline>
+        </w:drawing>
+      </w:r>
+    </w:p>
+    <w:p/>
+    <w:p>
+      <w:r>
+        <w:t>Cambiar y maniular las variables</w:t>
+      </w:r>
+    </w:p>
+    <w:p>
+      <w:r>
+        <w:drawing>
+          <wp:inline distT="0" distB="0" distL="0" distR="0" wp14:anchorId="62D7B1D2" wp14:editId="4E61AD8D">
+            <wp:extent cx="5612130" cy="879475"/>
+            <wp:effectExtent l="0" t="0" r="7620" b="0"/>
+            <wp:docPr id="1546368401" name="Imagen 1"/>
+            <wp:cNvGraphicFramePr>
+              <a:graphicFrameLocks xmlns:a="http://schemas.openxmlformats.org/drawingml/2006/main" noChangeAspect="1"/>
+            </wp:cNvGraphicFramePr>
+            <a:graphic xmlns:a="http://schemas.openxmlformats.org/drawingml/2006/main">
+              <a:graphicData uri="http://schemas.openxmlformats.org/drawingml/2006/picture">
+                <pic:pic xmlns:pic="http://schemas.openxmlformats.org/drawingml/2006/picture">
+                  <pic:nvPicPr>
+                    <pic:cNvPr id="1546368401" name=""/>
+                    <pic:cNvPicPr/>
+                  </pic:nvPicPr>
+                  <pic:blipFill>
+                    <a:blip r:embed="rId51"/>
+                    <a:stretch>
+                      <a:fillRect/>
+                    </a:stretch>
+                  </pic:blipFill>
+                  <pic:spPr>
+                    <a:xfrm>
+                      <a:off x="0" y="0"/>
+                      <a:ext cx="5612130" cy="879475"/>
+                    </a:xfrm>
+                    <a:prstGeom prst="rect">
+                      <a:avLst/>
+                    </a:prstGeom>
+                  </pic:spPr>
+                </pic:pic>
+              </a:graphicData>
+            </a:graphic>
+          </wp:inline>
+        </w:drawing>
+      </w:r>
+    </w:p>
+    <w:p/>
+    <w:p>
+      <w:pPr>
+        <w:numPr>
+          <w:ilvl w:val="0"/>
+          <w:numId w:val="3"/>
+        </w:numPr>
+      </w:pPr>
+      <w:r>
+        <w:lastRenderedPageBreak/>
+        <w:t>Frontend: http://localhost:4200</w:t>
+      </w:r>
+    </w:p>
+    <w:p>
+      <w:pPr>
+        <w:numPr>
+          <w:ilvl w:val="0"/>
+          <w:numId w:val="3"/>
+        </w:numPr>
+      </w:pPr>
+      <w:r>
+        <w:t>Backend API: </w:t>
+      </w:r>
+      <w:hyperlink r:id="rId52" w:history="1">
+        <w:r>
+          <w:rPr>
+            <w:rStyle w:val="Hipervnculo"/>
+          </w:rPr>
+          <w:t>http://localhost:8081/reservas</w:t>
+        </w:r>
+      </w:hyperlink>
+    </w:p>
+    <w:p/>
+    <w:p/>
+    <w:p>
+      <w:pPr>
+        <w:rPr>
+          <w:b/>
+          <w:bCs/>
+        </w:rPr>
+      </w:pPr>
+      <w:r>
+        <w:rPr>
+          <w:b/>
+          <w:bCs/>
+        </w:rPr>
+        <w:t>¿Qué son las señales en Angular?</w:t>
+      </w:r>
+    </w:p>
+    <w:p>
+      <w:r>
+        <w:t>Las señales son una incorporación reciente al paradigma de gestión de estado de Angular, introducida para simplificar la programación reactiva. Ofrecen una forma declarativa de gestionar y propagar los cambios de estado de manera eficiente.</w:t>
+      </w:r>
+    </w:p>
+    <w:p>
+      <w:pPr>
+        <w:rPr>
+          <w:b/>
+          <w:bCs/>
+        </w:rPr>
+      </w:pPr>
+      <w:r>
+        <w:rPr>
+          <w:b/>
+          <w:bCs/>
+        </w:rPr>
+        <w:t>¿Qué es </w:t>
+      </w:r>
+      <w:r>
+        <w:t>useState</w:t>
+      </w:r>
+      <w:r>
+        <w:rPr>
+          <w:b/>
+          <w:bCs/>
+        </w:rPr>
+        <w:t>React?</w:t>
+      </w:r>
+    </w:p>
+    <w:p>
+      <w:r>
+        <w:t>useStateEs un Hook integrado de React que permite a los componentes funcionales gestionar el estado. Permite a los componentes mantener y actualizar el estado local, al tiempo que garantiza que React vuelva a renderizar el componente cada vez que cambie el estado.</w:t>
+      </w:r>
+    </w:p>
+    <w:p>
+      <w:pPr>
+        <w:rPr>
+          <w:b/>
+          <w:bCs/>
+        </w:rPr>
+      </w:pPr>
+      <w:r>
+        <w:rPr>
+          <w:b/>
+          <w:bCs/>
+        </w:rPr>
+        <w:t>1. Actualizaciones granulares:</w:t>
+      </w:r>
+    </w:p>
+    <w:p>
+      <w:pPr>
+        <w:numPr>
+          <w:ilvl w:val="0"/>
+          <w:numId w:val="4"/>
+        </w:numPr>
+      </w:pPr>
+      <w:r>
+        <w:rPr>
+          <w:b/>
+          <w:bCs/>
+        </w:rPr>
+        <w:t>Señales de Angular:</w:t>
+      </w:r>
+      <w:r>
+        <w:t> Angular realiza un seguimiento de las dependencias detalladas y actualiza solo las partes de la vista que dependen de la señal modificada. Esto reduce las renderizaciones innecesarias y mejora el rendimiento.</w:t>
+      </w:r>
+    </w:p>
+    <w:p>
+      <w:pPr>
+        <w:numPr>
+          <w:ilvl w:val="0"/>
+          <w:numId w:val="4"/>
+        </w:numPr>
+      </w:pPr>
+      <w:r>
+        <w:rPr>
+          <w:b/>
+          <w:bCs/>
+        </w:rPr>
+        <w:t>React useState:</w:t>
+      </w:r>
+      <w:r>
+        <w:t> React vuelve a renderizar todo el componente donde se utiliza el estado. Esto puede provocar renderizaciones más frecuentes, aunque el DOM virtual de React ayuda a optimizar el proceso.</w:t>
+      </w:r>
+    </w:p>
+    <w:p/>
+    <w:p>
+      <w:r>
+        <w:drawing>
+          <wp:inline distT="0" distB="0" distL="0" distR="0" wp14:anchorId="04E623FB" wp14:editId="53846A59">
+            <wp:extent cx="5612130" cy="2929890"/>
+            <wp:effectExtent l="0" t="0" r="7620" b="3810"/>
+            <wp:docPr id="793730466" name="Imagen 1"/>
+            <wp:cNvGraphicFramePr>
+              <a:graphicFrameLocks xmlns:a="http://schemas.openxmlformats.org/drawingml/2006/main" noChangeAspect="1"/>
+            </wp:cNvGraphicFramePr>
+            <a:graphic xmlns:a="http://schemas.openxmlformats.org/drawingml/2006/main">
+              <a:graphicData uri="http://schemas.openxmlformats.org/drawingml/2006/picture">
+                <pic:pic xmlns:pic="http://schemas.openxmlformats.org/drawingml/2006/picture">
+                  <pic:nvPicPr>
+                    <pic:cNvPr id="793730466" name=""/>
+                    <pic:cNvPicPr/>
+                  </pic:nvPicPr>
+                  <pic:blipFill>
+                    <a:blip r:embed="rId53"/>
+                    <a:stretch>
+                      <a:fillRect/>
+                    </a:stretch>
+                  </pic:blipFill>
+                  <pic:spPr>
+                    <a:xfrm>
+                      <a:off x="0" y="0"/>
+                      <a:ext cx="5612130" cy="2929890"/>
+                    </a:xfrm>
+                    <a:prstGeom prst="rect">
+                      <a:avLst/>
+                    </a:prstGeom>
+                  </pic:spPr>
+                </pic:pic>
+              </a:graphicData>
+            </a:graphic>
+          </wp:inline>
+        </w:drawing>
+      </w:r>
+    </w:p>
+    <w:p/>
+    <w:p>
+      <w:r>
+        <w:t>Relacionar front con backend</w:t>
+      </w:r>
+    </w:p>
+    <w:p>
+      <w:r>
+        <w:lastRenderedPageBreak/>
+        <w:drawing>
+          <wp:inline distT="0" distB="0" distL="0" distR="0" wp14:anchorId="104A0397" wp14:editId="1703E3C0">
+            <wp:extent cx="5612130" cy="1801495"/>
+            <wp:effectExtent l="0" t="0" r="7620" b="8255"/>
+            <wp:docPr id="1315597283" name="Imagen 1"/>
+            <wp:cNvGraphicFramePr>
+              <a:graphicFrameLocks xmlns:a="http://schemas.openxmlformats.org/drawingml/2006/main" noChangeAspect="1"/>
+            </wp:cNvGraphicFramePr>
+            <a:graphic xmlns:a="http://schemas.openxmlformats.org/drawingml/2006/main">
+              <a:graphicData uri="http://schemas.openxmlformats.org/drawingml/2006/picture">
+                <pic:pic xmlns:pic="http://schemas.openxmlformats.org/drawingml/2006/picture">
+                  <pic:nvPicPr>
+                    <pic:cNvPr id="1315597283" name=""/>
+                    <pic:cNvPicPr/>
+                  </pic:nvPicPr>
+                  <pic:blipFill>
+                    <a:blip r:embed="rId54"/>
+                    <a:stretch>
+                      <a:fillRect/>
+                    </a:stretch>
+                  </pic:blipFill>
+                  <pic:spPr>
+                    <a:xfrm>
+                      <a:off x="0" y="0"/>
+                      <a:ext cx="5612130" cy="1801495"/>
+                    </a:xfrm>
+                    <a:prstGeom prst="rect">
+                      <a:avLst/>
+                    </a:prstGeom>
+                  </pic:spPr>
+                </pic:pic>
+              </a:graphicData>
+            </a:graphic>
+          </wp:inline>
+        </w:drawing>
+      </w:r>
+    </w:p>
     <w:sectPr>
       <w:pgSz w:w="12240" w:h="15840"/>
       <w:pgMar w:top="142" w:right="1701" w:bottom="0" w:left="1701" w:header="708" w:footer="708" w:gutter="0"/>
@@ -2247,9 +3810,158 @@
     </w:lvl>
   </w:abstractNum>
   <w:abstractNum w:abstractNumId="1" w15:restartNumberingAfterBreak="0">
-    <w:nsid w:val="63A045F6"/>
+    <w:nsid w:val="17380328"/>
     <w:multiLevelType w:val="multilevel"/>
-    <w:tmpl w:val="60809860"/>
+    <w:tmpl w:val="8E40B6C6"/>
+    <w:lvl w:ilvl="0">
+      <w:start w:val="1"/>
+      <w:numFmt w:val="bullet"/>
+      <w:lvlText w:val=""/>
+      <w:lvlJc w:val="left"/>
+      <w:pPr>
+        <w:tabs>
+          <w:tab w:val="num" w:pos="720"/>
+        </w:tabs>
+        <w:ind w:left="720" w:hanging="360"/>
+      </w:pPr>
+      <w:rPr>
+        <w:rFonts w:ascii="Symbol" w:hAnsi="Symbol" w:hint="default"/>
+        <w:sz w:val="20"/>
+      </w:rPr>
+    </w:lvl>
+    <w:lvl w:ilvl="1" w:tentative="1">
+      <w:start w:val="1"/>
+      <w:numFmt w:val="bullet"/>
+      <w:lvlText w:val=""/>
+      <w:lvlJc w:val="left"/>
+      <w:pPr>
+        <w:tabs>
+          <w:tab w:val="num" w:pos="1440"/>
+        </w:tabs>
+        <w:ind w:left="1440" w:hanging="360"/>
+      </w:pPr>
+      <w:rPr>
+        <w:rFonts w:ascii="Symbol" w:hAnsi="Symbol" w:hint="default"/>
+        <w:sz w:val="20"/>
+      </w:rPr>
+    </w:lvl>
+    <w:lvl w:ilvl="2" w:tentative="1">
+      <w:start w:val="1"/>
+      <w:numFmt w:val="bullet"/>
+      <w:lvlText w:val=""/>
+      <w:lvlJc w:val="left"/>
+      <w:pPr>
+        <w:tabs>
+          <w:tab w:val="num" w:pos="2160"/>
+        </w:tabs>
+        <w:ind w:left="2160" w:hanging="360"/>
+      </w:pPr>
+      <w:rPr>
+        <w:rFonts w:ascii="Symbol" w:hAnsi="Symbol" w:hint="default"/>
+        <w:sz w:val="20"/>
+      </w:rPr>
+    </w:lvl>
+    <w:lvl w:ilvl="3" w:tentative="1">
+      <w:start w:val="1"/>
+      <w:numFmt w:val="bullet"/>
+      <w:lvlText w:val=""/>
+      <w:lvlJc w:val="left"/>
+      <w:pPr>
+        <w:tabs>
+          <w:tab w:val="num" w:pos="2880"/>
+        </w:tabs>
+        <w:ind w:left="2880" w:hanging="360"/>
+      </w:pPr>
+      <w:rPr>
+        <w:rFonts w:ascii="Symbol" w:hAnsi="Symbol" w:hint="default"/>
+        <w:sz w:val="20"/>
+      </w:rPr>
+    </w:lvl>
+    <w:lvl w:ilvl="4" w:tentative="1">
+      <w:start w:val="1"/>
+      <w:numFmt w:val="bullet"/>
+      <w:lvlText w:val=""/>
+      <w:lvlJc w:val="left"/>
+      <w:pPr>
+        <w:tabs>
+          <w:tab w:val="num" w:pos="3600"/>
+        </w:tabs>
+        <w:ind w:left="3600" w:hanging="360"/>
+      </w:pPr>
+      <w:rPr>
+        <w:rFonts w:ascii="Symbol" w:hAnsi="Symbol" w:hint="default"/>
+        <w:sz w:val="20"/>
+      </w:rPr>
+    </w:lvl>
+    <w:lvl w:ilvl="5" w:tentative="1">
+      <w:start w:val="1"/>
+      <w:numFmt w:val="bullet"/>
+      <w:lvlText w:val=""/>
+      <w:lvlJc w:val="left"/>
+      <w:pPr>
+        <w:tabs>
+          <w:tab w:val="num" w:pos="4320"/>
+        </w:tabs>
+        <w:ind w:left="4320" w:hanging="360"/>
+      </w:pPr>
+      <w:rPr>
+        <w:rFonts w:ascii="Symbol" w:hAnsi="Symbol" w:hint="default"/>
+        <w:sz w:val="20"/>
+      </w:rPr>
+    </w:lvl>
+    <w:lvl w:ilvl="6" w:tentative="1">
+      <w:start w:val="1"/>
+      <w:numFmt w:val="bullet"/>
+      <w:lvlText w:val=""/>
+      <w:lvlJc w:val="left"/>
+      <w:pPr>
+        <w:tabs>
+          <w:tab w:val="num" w:pos="5040"/>
+        </w:tabs>
+        <w:ind w:left="5040" w:hanging="360"/>
+      </w:pPr>
+      <w:rPr>
+        <w:rFonts w:ascii="Symbol" w:hAnsi="Symbol" w:hint="default"/>
+        <w:sz w:val="20"/>
+      </w:rPr>
+    </w:lvl>
+    <w:lvl w:ilvl="7" w:tentative="1">
+      <w:start w:val="1"/>
+      <w:numFmt w:val="bullet"/>
+      <w:lvlText w:val=""/>
+      <w:lvlJc w:val="left"/>
+      <w:pPr>
+        <w:tabs>
+          <w:tab w:val="num" w:pos="5760"/>
+        </w:tabs>
+        <w:ind w:left="5760" w:hanging="360"/>
+      </w:pPr>
+      <w:rPr>
+        <w:rFonts w:ascii="Symbol" w:hAnsi="Symbol" w:hint="default"/>
+        <w:sz w:val="20"/>
+      </w:rPr>
+    </w:lvl>
+    <w:lvl w:ilvl="8" w:tentative="1">
+      <w:start w:val="1"/>
+      <w:numFmt w:val="bullet"/>
+      <w:lvlText w:val=""/>
+      <w:lvlJc w:val="left"/>
+      <w:pPr>
+        <w:tabs>
+          <w:tab w:val="num" w:pos="6480"/>
+        </w:tabs>
+        <w:ind w:left="6480" w:hanging="360"/>
+      </w:pPr>
+      <w:rPr>
+        <w:rFonts w:ascii="Symbol" w:hAnsi="Symbol" w:hint="default"/>
+        <w:sz w:val="20"/>
+      </w:rPr>
+    </w:lvl>
+  </w:abstractNum>
+  <w:abstractNum w:abstractNumId="2" w15:restartNumberingAfterBreak="0">
+    <w:nsid w:val="61D03003"/>
+    <w:multiLevelType w:val="multilevel"/>
+    <w:tmpl w:val="64465CBC"/>
     <w:lvl w:ilvl="0">
       <w:start w:val="1"/>
       <w:numFmt w:val="bullet"/>
@@ -2395,11 +4107,166 @@
       </w:rPr>
     </w:lvl>
   </w:abstractNum>
+  <w:abstractNum w:abstractNumId="3" w15:restartNumberingAfterBreak="0">
+    <w:nsid w:val="63A045F6"/>
+    <w:multiLevelType w:val="multilevel"/>
+    <w:tmpl w:val="60809860"/>
+    <w:lvl w:ilvl="0">
+      <w:start w:val="1"/>
+      <w:numFmt w:val="bullet"/>
+      <w:lvlText w:val=""/>
+      <w:lvlJc w:val="left"/>
+      <w:pPr>
+        <w:tabs>
+          <w:tab w:val="num" w:pos="720"/>
+        </w:tabs>
+        <w:ind w:left="720" w:hanging="360"/>
+      </w:pPr>
+      <w:rPr>
+        <w:rFonts w:ascii="Symbol" w:hAnsi="Symbol" w:hint="default"/>
+        <w:sz w:val="20"/>
+      </w:rPr>
+    </w:lvl>
+    <w:lvl w:ilvl="1" w:tentative="1">
+      <w:start w:val="1"/>
+      <w:numFmt w:val="bullet"/>
+      <w:lvlText w:val="o"/>
+      <w:lvlJc w:val="left"/>
+      <w:pPr>
+        <w:tabs>
+          <w:tab w:val="num" w:pos="1440"/>
+        </w:tabs>
+        <w:ind w:left="1440" w:hanging="360"/>
+      </w:pPr>
+      <w:rPr>
+        <w:rFonts w:ascii="Courier New" w:hAnsi="Courier New" w:hint="default"/>
+        <w:sz w:val="20"/>
+      </w:rPr>
+    </w:lvl>
+    <w:lvl w:ilvl="2" w:tentative="1">
+      <w:start w:val="1"/>
+      <w:numFmt w:val="bullet"/>
+      <w:lvlText w:val=""/>
+      <w:lvlJc w:val="left"/>
+      <w:pPr>
+        <w:tabs>
+          <w:tab w:val="num" w:pos="2160"/>
+        </w:tabs>
+        <w:ind w:left="2160" w:hanging="360"/>
+      </w:pPr>
+      <w:rPr>
+        <w:rFonts w:ascii="Wingdings" w:hAnsi="Wingdings" w:hint="default"/>
+        <w:sz w:val="20"/>
+      </w:rPr>
+    </w:lvl>
+    <w:lvl w:ilvl="3" w:tentative="1">
+      <w:start w:val="1"/>
+      <w:numFmt w:val="bullet"/>
+      <w:lvlText w:val=""/>
+      <w:lvlJc w:val="left"/>
+      <w:pPr>
+        <w:tabs>
+          <w:tab w:val="num" w:pos="2880"/>
+        </w:tabs>
+        <w:ind w:left="2880" w:hanging="360"/>
+      </w:pPr>
+      <w:rPr>
+        <w:rFonts w:ascii="Wingdings" w:hAnsi="Wingdings" w:hint="default"/>
+        <w:sz w:val="20"/>
+      </w:rPr>
+    </w:lvl>
+    <w:lvl w:ilvl="4" w:tentative="1">
+      <w:start w:val="1"/>
+      <w:numFmt w:val="bullet"/>
+      <w:lvlText w:val=""/>
+      <w:lvlJc w:val="left"/>
+      <w:pPr>
+        <w:tabs>
+          <w:tab w:val="num" w:pos="3600"/>
+        </w:tabs>
+        <w:ind w:left="3600" w:hanging="360"/>
+      </w:pPr>
+      <w:rPr>
+        <w:rFonts w:ascii="Wingdings" w:hAnsi="Wingdings" w:hint="default"/>
+        <w:sz w:val="20"/>
+      </w:rPr>
+    </w:lvl>
+    <w:lvl w:ilvl="5" w:tentative="1">
+      <w:start w:val="1"/>
+      <w:numFmt w:val="bullet"/>
+      <w:lvlText w:val=""/>
+      <w:lvlJc w:val="left"/>
+      <w:pPr>
+        <w:tabs>
+          <w:tab w:val="num" w:pos="4320"/>
+        </w:tabs>
+        <w:ind w:left="4320" w:hanging="360"/>
+      </w:pPr>
+      <w:rPr>
+        <w:rFonts w:ascii="Wingdings" w:hAnsi="Wingdings" w:hint="default"/>
+        <w:sz w:val="20"/>
+      </w:rPr>
+    </w:lvl>
+    <w:lvl w:ilvl="6" w:tentative="1">
+      <w:start w:val="1"/>
+      <w:numFmt w:val="bullet"/>
+      <w:lvlText w:val=""/>
+      <w:lvlJc w:val="left"/>
+      <w:pPr>
+        <w:tabs>
+          <w:tab w:val="num" w:pos="5040"/>
+        </w:tabs>
+        <w:ind w:left="5040" w:hanging="360"/>
+      </w:pPr>
+      <w:rPr>
+        <w:rFonts w:ascii="Wingdings" w:hAnsi="Wingdings" w:hint="default"/>
+        <w:sz w:val="20"/>
+      </w:rPr>
+    </w:lvl>
+    <w:lvl w:ilvl="7" w:tentative="1">
+      <w:start w:val="1"/>
+      <w:numFmt w:val="bullet"/>
+      <w:lvlText w:val=""/>
+      <w:lvlJc w:val="left"/>
+      <w:pPr>
+        <w:tabs>
+          <w:tab w:val="num" w:pos="5760"/>
+        </w:tabs>
+        <w:ind w:left="5760" w:hanging="360"/>
+      </w:pPr>
+      <w:rPr>
+        <w:rFonts w:ascii="Wingdings" w:hAnsi="Wingdings" w:hint="default"/>
+        <w:sz w:val="20"/>
+      </w:rPr>
+    </w:lvl>
+    <w:lvl w:ilvl="8" w:tentative="1">
+      <w:start w:val="1"/>
+      <w:numFmt w:val="bullet"/>
+      <w:lvlText w:val=""/>
+      <w:lvlJc w:val="left"/>
+      <w:pPr>
+        <w:tabs>
+          <w:tab w:val="num" w:pos="6480"/>
+        </w:tabs>
+        <w:ind w:left="6480" w:hanging="360"/>
+      </w:pPr>
+      <w:rPr>
+        <w:rFonts w:ascii="Wingdings" w:hAnsi="Wingdings" w:hint="default"/>
+        <w:sz w:val="20"/>
+      </w:rPr>
+    </w:lvl>
+  </w:abstractNum>
   <w:num w:numId="1" w16cid:durableId="1956062615">
     <w:abstractNumId w:val="0"/>
   </w:num>
   <w:num w:numId="2" w16cid:durableId="2144807304">
+    <w:abstractNumId w:val="3"/>
+  </w:num>
+  <w:num w:numId="3" w16cid:durableId="574439166">
     <w:abstractNumId w:val="1"/>
+  </w:num>
+  <w:num w:numId="4" w16cid:durableId="290207176">
+    <w:abstractNumId w:val="2"/>
   </w:num>
 </w:numbering>
 </file>

</xml_diff>